<commit_message>
Acerto texto doc tuas mãos
</commit_message>
<xml_diff>
--- a/DOC/Cura-me Senhor.docx
+++ b/DOC/Cura-me Senhor.docx
@@ -50,18 +50,10 @@
       </w:r>
     </w:p>
     <w:p>
-      <w:pPr>
-        <w:rPr>
-          <w:lang w:val="en-US"/>
-        </w:rPr>
-      </w:pPr>
       <w:r>
         <w:tab/>
       </w:r>
       <w:r>
-        <w:rPr>
-          <w:lang w:val="en-US"/>
-        </w:rPr>
         <w:t>I</w:t>
       </w:r>
     </w:p>
@@ -78,7 +70,19 @@
         <w:spacing w:after="0" w:line="360" w:lineRule="auto"/>
       </w:pPr>
       <w:r>
-        <w:t>e não pude contemplar as belezas de Tua mão.</w:t>
+        <w:t xml:space="preserve">e não pude contemplar as belezas </w:t>
+      </w:r>
+      <w:r>
+        <w:t>de tuas</w:t>
+      </w:r>
+      <w:r>
+        <w:t xml:space="preserve"> mão</w:t>
+      </w:r>
+      <w:r>
+        <w:t>s</w:t>
+      </w:r>
+      <w:r>
+        <w:t>.</w:t>
       </w:r>
     </w:p>
     <w:p>
@@ -106,17 +110,11 @@
     <w:p>
       <w:pPr>
         <w:spacing w:after="0" w:line="360" w:lineRule="auto"/>
-        <w:rPr>
-          <w:lang w:val="en-US"/>
-        </w:rPr>
       </w:pPr>
       <w:r>
         <w:tab/>
       </w:r>
       <w:r>
-        <w:rPr>
-          <w:lang w:val="en-US"/>
-        </w:rPr>
         <w:t>II</w:t>
       </w:r>
     </w:p>
@@ -270,13 +268,7 @@
         <w:spacing w:after="0" w:line="360" w:lineRule="auto"/>
       </w:pPr>
       <w:r>
-        <w:t xml:space="preserve">Faça o Teu </w:t>
-      </w:r>
-      <w:r>
-        <w:t xml:space="preserve">querer, </w:t>
-      </w:r>
-      <w:r>
-        <w:t>na minha vida</w:t>
+        <w:t>Faça o Teu querer, na minha vida</w:t>
       </w:r>
     </w:p>
     <w:p>
@@ -316,7 +308,15 @@
         <w:spacing w:after="0" w:line="360" w:lineRule="auto"/>
       </w:pPr>
       <w:r>
-        <w:t>Pra que eu possa novamente fazer o Teu querer, Teu querer em mim</w:t>
+        <w:t xml:space="preserve">Pra que eu possa novamente fazer o Teu querer, </w:t>
+      </w:r>
+      <w:proofErr w:type="gramStart"/>
+      <w:r>
+        <w:t>Teu</w:t>
+      </w:r>
+      <w:proofErr w:type="gramEnd"/>
+      <w:r>
+        <w:t xml:space="preserve"> querer em mim</w:t>
       </w:r>
     </w:p>
     <w:sectPr>

</xml_diff>